<commit_message>
Sync repo copies of owner docs 04 and 05 with their Drive versions
These are the owner's own Drive edits of 2 October 2026, synced to the
repo copies; no agent wording was added.

- Doc 04 (md): the two edits the owner applied on Drive with fixDocs.gs
  (report generator after a reset; recording details in the research
  export), applied to the md copy from the same edits.js. Verified
  against the live Drive doc: both paragraphs match.
- Doc 05 (docx): replaced byte for byte with the current Drive file.
  Text changes vs. the old repo copy: the addition-board sentence
  (board stays until the learner closes it), plus the owner's earlier
  Drive edits the repo copy was missing (row numbering, one example cell).

Co-Authored-By: Claude Opus 5.5 <noreply@anthropic.com>
</commit_message>
<xml_diff>
--- a/מסמכי אפיון/מקור פדגוגי/05- המטריקס מעודכן ומאושר.docx
+++ b/מסמכי אפיון/מקור פדגוגי/05- המטריקס מעודכן ומאושר.docx
@@ -3516,8 +3516,587 @@
                 <w:szCs w:val="24"/>
                 <w:rtl w:val="1"/>
               </w:rPr>
-              <w:t xml:space="preserve">ק</w:t>
-            </w:r>
+              <w:t xml:space="preserve">חינוך</w:t>
+            </w:r>
+            <w:r>
+              <w:rPr>
+                <w:rFonts w:ascii="David" w:cs="David" w:eastAsia="David" w:hAnsi="David"/>
+                <w:sz w:val="24"/>
+                <w:szCs w:val="24"/>
+                <w:rtl w:val="1"/>
+              </w:rPr>
+              <w:t xml:space="preserve"> </w:t>
+            </w:r>
+            <w:r>
+              <w:rPr>
+                <w:rFonts w:ascii="David" w:cs="David" w:eastAsia="David" w:hAnsi="David"/>
+                <w:sz w:val="24"/>
+                <w:szCs w:val="24"/>
+                <w:rtl w:val="1"/>
+              </w:rPr>
+              <w:t xml:space="preserve">רגיל</w:t>
+            </w:r>
+            <w:r>
+              <w:rPr>
+                <w:rFonts w:ascii="David" w:cs="David" w:eastAsia="David" w:hAnsi="David"/>
+                <w:sz w:val="24"/>
+                <w:szCs w:val="24"/>
+                <w:rtl w:val="1"/>
+              </w:rPr>
+              <w:t xml:space="preserve">:</w:t>
+              <w:br w:type="textWrapping"/>
+              <w:t xml:space="preserve">• </w:t>
+            </w:r>
+            <w:r>
+              <w:rPr>
+                <w:rFonts w:ascii="David" w:cs="David" w:eastAsia="David" w:hAnsi="David"/>
+                <w:sz w:val="24"/>
+                <w:szCs w:val="24"/>
+                <w:rtl w:val="1"/>
+              </w:rPr>
+              <w:t xml:space="preserve">ספרו</w:t>
+            </w:r>
+            <w:r>
+              <w:rPr>
+                <w:rFonts w:ascii="David" w:cs="David" w:eastAsia="David" w:hAnsi="David"/>
+                <w:sz w:val="24"/>
+                <w:szCs w:val="24"/>
+                <w:rtl w:val="1"/>
+              </w:rPr>
+              <w:t xml:space="preserve"> </w:t>
+            </w:r>
+            <w:r>
+              <w:rPr>
+                <w:rFonts w:ascii="David" w:cs="David" w:eastAsia="David" w:hAnsi="David"/>
+                <w:sz w:val="24"/>
+                <w:szCs w:val="24"/>
+                <w:rtl w:val="1"/>
+              </w:rPr>
+              <w:t xml:space="preserve">מ</w:t>
+            </w:r>
+            <w:r>
+              <w:rPr>
+                <w:rFonts w:ascii="David" w:cs="David" w:eastAsia="David" w:hAnsi="David"/>
+                <w:sz w:val="24"/>
+                <w:szCs w:val="24"/>
+                <w:rtl w:val="1"/>
+              </w:rPr>
+              <w:t xml:space="preserve">-37 </w:t>
+            </w:r>
+            <w:r>
+              <w:rPr>
+                <w:rFonts w:ascii="David" w:cs="David" w:eastAsia="David" w:hAnsi="David"/>
+                <w:sz w:val="24"/>
+                <w:szCs w:val="24"/>
+                <w:rtl w:val="1"/>
+              </w:rPr>
+              <w:t xml:space="preserve">עד</w:t>
+            </w:r>
+            <w:r>
+              <w:rPr>
+                <w:rFonts w:ascii="David" w:cs="David" w:eastAsia="David" w:hAnsi="David"/>
+                <w:sz w:val="24"/>
+                <w:szCs w:val="24"/>
+                <w:rtl w:val="1"/>
+              </w:rPr>
+              <w:t xml:space="preserve"> 45.</w:t>
+              <w:br w:type="textWrapping"/>
+              <w:t xml:space="preserve">• </w:t>
+            </w:r>
+            <w:r>
+              <w:rPr>
+                <w:rFonts w:ascii="David" w:cs="David" w:eastAsia="David" w:hAnsi="David"/>
+                <w:sz w:val="24"/>
+                <w:szCs w:val="24"/>
+                <w:rtl w:val="1"/>
+              </w:rPr>
+              <w:t xml:space="preserve">מה</w:t>
+            </w:r>
+            <w:r>
+              <w:rPr>
+                <w:rFonts w:ascii="David" w:cs="David" w:eastAsia="David" w:hAnsi="David"/>
+                <w:sz w:val="24"/>
+                <w:szCs w:val="24"/>
+                <w:rtl w:val="1"/>
+              </w:rPr>
+              <w:t xml:space="preserve"> </w:t>
+            </w:r>
+            <w:r>
+              <w:rPr>
+                <w:rFonts w:ascii="David" w:cs="David" w:eastAsia="David" w:hAnsi="David"/>
+                <w:sz w:val="24"/>
+                <w:szCs w:val="24"/>
+                <w:rtl w:val="1"/>
+              </w:rPr>
+              <w:t xml:space="preserve">העוקב</w:t>
+            </w:r>
+            <w:r>
+              <w:rPr>
+                <w:rFonts w:ascii="David" w:cs="David" w:eastAsia="David" w:hAnsi="David"/>
+                <w:sz w:val="24"/>
+                <w:szCs w:val="24"/>
+                <w:rtl w:val="1"/>
+              </w:rPr>
+              <w:t xml:space="preserve"> </w:t>
+            </w:r>
+            <w:r>
+              <w:rPr>
+                <w:rFonts w:ascii="David" w:cs="David" w:eastAsia="David" w:hAnsi="David"/>
+                <w:sz w:val="24"/>
+                <w:szCs w:val="24"/>
+                <w:rtl w:val="1"/>
+              </w:rPr>
+              <w:t xml:space="preserve">של</w:t>
+            </w:r>
+            <w:r>
+              <w:rPr>
+                <w:rFonts w:ascii="David" w:cs="David" w:eastAsia="David" w:hAnsi="David"/>
+                <w:sz w:val="24"/>
+                <w:szCs w:val="24"/>
+                <w:rtl w:val="1"/>
+              </w:rPr>
+              <w:t xml:space="preserve"> 89?</w:t>
+              <w:br w:type="textWrapping"/>
+              <w:t xml:space="preserve">• </w:t>
+            </w:r>
+            <w:r>
+              <w:rPr>
+                <w:rFonts w:ascii="David" w:cs="David" w:eastAsia="David" w:hAnsi="David"/>
+                <w:sz w:val="24"/>
+                <w:szCs w:val="24"/>
+                <w:rtl w:val="1"/>
+              </w:rPr>
+              <w:t xml:space="preserve">התאמת</w:t>
+            </w:r>
+            <w:r>
+              <w:rPr>
+                <w:rFonts w:ascii="David" w:cs="David" w:eastAsia="David" w:hAnsi="David"/>
+                <w:sz w:val="24"/>
+                <w:szCs w:val="24"/>
+                <w:rtl w:val="1"/>
+              </w:rPr>
+              <w:t xml:space="preserve"> 40 </w:t>
+            </w:r>
+            <w:r>
+              <w:rPr>
+                <w:rFonts w:ascii="David" w:cs="David" w:eastAsia="David" w:hAnsi="David"/>
+                <w:sz w:val="24"/>
+                <w:szCs w:val="24"/>
+                <w:rtl w:val="1"/>
+              </w:rPr>
+              <w:t xml:space="preserve">ל</w:t>
+            </w:r>
+            <w:r>
+              <w:rPr>
+                <w:rFonts w:ascii="David" w:cs="David" w:eastAsia="David" w:hAnsi="David"/>
+                <w:sz w:val="24"/>
+                <w:szCs w:val="24"/>
+                <w:rtl w:val="1"/>
+              </w:rPr>
+              <w:t xml:space="preserve">-4 </w:t>
+            </w:r>
+            <w:r>
+              <w:rPr>
+                <w:rFonts w:ascii="David" w:cs="David" w:eastAsia="David" w:hAnsi="David"/>
+                <w:sz w:val="24"/>
+                <w:szCs w:val="24"/>
+                <w:rtl w:val="1"/>
+              </w:rPr>
+              <w:t xml:space="preserve">עשרות</w:t>
+            </w:r>
+            <w:r>
+              <w:rPr>
+                <w:rFonts w:ascii="David" w:cs="David" w:eastAsia="David" w:hAnsi="David"/>
+                <w:sz w:val="24"/>
+                <w:szCs w:val="24"/>
+                <w:rtl w:val="1"/>
+              </w:rPr>
+              <w:t xml:space="preserve">.</w:t>
+              <w:br w:type="textWrapping"/>
+              <w:br w:type="textWrapping"/>
+            </w:r>
+            <w:r>
+              <w:rPr>
+                <w:rFonts w:ascii="David" w:cs="David" w:eastAsia="David" w:hAnsi="David"/>
+                <w:sz w:val="24"/>
+                <w:szCs w:val="24"/>
+                <w:rtl w:val="1"/>
+              </w:rPr>
+              <w:t xml:space="preserve">חנ</w:t>
+            </w:r>
+            <w:r>
+              <w:rPr>
+                <w:rFonts w:ascii="David" w:cs="David" w:eastAsia="David" w:hAnsi="David"/>
+                <w:sz w:val="24"/>
+                <w:szCs w:val="24"/>
+                <w:rtl w:val="1"/>
+              </w:rPr>
+              <w:t xml:space="preserve">"</w:t>
+            </w:r>
+            <w:r>
+              <w:rPr>
+                <w:rFonts w:ascii="David" w:cs="David" w:eastAsia="David" w:hAnsi="David"/>
+                <w:sz w:val="24"/>
+                <w:szCs w:val="24"/>
+                <w:rtl w:val="1"/>
+              </w:rPr>
+              <w:t xml:space="preserve">מ</w:t>
+            </w:r>
+            <w:r>
+              <w:rPr>
+                <w:rFonts w:ascii="David" w:cs="David" w:eastAsia="David" w:hAnsi="David"/>
+                <w:sz w:val="24"/>
+                <w:szCs w:val="24"/>
+                <w:rtl w:val="1"/>
+              </w:rPr>
+              <w:t xml:space="preserve">:</w:t>
+              <w:br w:type="textWrapping"/>
+              <w:t xml:space="preserve">• </w:t>
+            </w:r>
+            <w:r>
+              <w:rPr>
+                <w:rFonts w:ascii="David" w:cs="David" w:eastAsia="David" w:hAnsi="David"/>
+                <w:sz w:val="24"/>
+                <w:szCs w:val="24"/>
+                <w:rtl w:val="1"/>
+              </w:rPr>
+              <w:t xml:space="preserve">ספירה</w:t>
+            </w:r>
+            <w:r>
+              <w:rPr>
+                <w:rFonts w:ascii="David" w:cs="David" w:eastAsia="David" w:hAnsi="David"/>
+                <w:sz w:val="24"/>
+                <w:szCs w:val="24"/>
+                <w:rtl w:val="1"/>
+              </w:rPr>
+              <w:t xml:space="preserve"> </w:t>
+            </w:r>
+            <w:r>
+              <w:rPr>
+                <w:rFonts w:ascii="David" w:cs="David" w:eastAsia="David" w:hAnsi="David"/>
+                <w:sz w:val="24"/>
+                <w:szCs w:val="24"/>
+                <w:rtl w:val="1"/>
+              </w:rPr>
+              <w:t xml:space="preserve">מ</w:t>
+            </w:r>
+            <w:r>
+              <w:rPr>
+                <w:rFonts w:ascii="David" w:cs="David" w:eastAsia="David" w:hAnsi="David"/>
+                <w:sz w:val="24"/>
+                <w:szCs w:val="24"/>
+                <w:rtl w:val="1"/>
+              </w:rPr>
+              <w:t xml:space="preserve">-1 </w:t>
+            </w:r>
+            <w:r>
+              <w:rPr>
+                <w:rFonts w:ascii="David" w:cs="David" w:eastAsia="David" w:hAnsi="David"/>
+                <w:sz w:val="24"/>
+                <w:szCs w:val="24"/>
+                <w:rtl w:val="1"/>
+              </w:rPr>
+              <w:t xml:space="preserve">עד</w:t>
+            </w:r>
+            <w:r>
+              <w:rPr>
+                <w:rFonts w:ascii="David" w:cs="David" w:eastAsia="David" w:hAnsi="David"/>
+                <w:sz w:val="24"/>
+                <w:szCs w:val="24"/>
+                <w:rtl w:val="1"/>
+              </w:rPr>
+              <w:t xml:space="preserve"> 20.</w:t>
+              <w:br w:type="textWrapping"/>
+              <w:br w:type="textWrapping"/>
+              <w:t xml:space="preserve">🛠️ </w:t>
+            </w:r>
+            <w:r>
+              <w:rPr>
+                <w:rFonts w:ascii="David" w:cs="David" w:eastAsia="David" w:hAnsi="David"/>
+                <w:sz w:val="24"/>
+                <w:szCs w:val="24"/>
+                <w:rtl w:val="1"/>
+              </w:rPr>
+              <w:t xml:space="preserve">אמצעי</w:t>
+            </w:r>
+            <w:r>
+              <w:rPr>
+                <w:rFonts w:ascii="David" w:cs="David" w:eastAsia="David" w:hAnsi="David"/>
+                <w:sz w:val="24"/>
+                <w:szCs w:val="24"/>
+                <w:rtl w:val="1"/>
+              </w:rPr>
+              <w:t xml:space="preserve"> </w:t>
+            </w:r>
+            <w:r>
+              <w:rPr>
+                <w:rFonts w:ascii="David" w:cs="David" w:eastAsia="David" w:hAnsi="David"/>
+                <w:sz w:val="24"/>
+                <w:szCs w:val="24"/>
+                <w:rtl w:val="1"/>
+              </w:rPr>
+              <w:t xml:space="preserve">עזר</w:t>
+            </w:r>
+            <w:r>
+              <w:rPr>
+                <w:rFonts w:ascii="David" w:cs="David" w:eastAsia="David" w:hAnsi="David"/>
+                <w:sz w:val="24"/>
+                <w:szCs w:val="24"/>
+                <w:rtl w:val="1"/>
+              </w:rPr>
+              <w:t xml:space="preserve"> </w:t>
+            </w:r>
+            <w:r>
+              <w:rPr>
+                <w:rFonts w:ascii="David" w:cs="David" w:eastAsia="David" w:hAnsi="David"/>
+                <w:sz w:val="24"/>
+                <w:szCs w:val="24"/>
+                <w:rtl w:val="1"/>
+              </w:rPr>
+              <w:t xml:space="preserve">חובה</w:t>
+            </w:r>
+            <w:r>
+              <w:rPr>
+                <w:rFonts w:ascii="David" w:cs="David" w:eastAsia="David" w:hAnsi="David"/>
+                <w:sz w:val="24"/>
+                <w:szCs w:val="24"/>
+                <w:rtl w:val="1"/>
+              </w:rPr>
+              <w:t xml:space="preserve"> </w:t>
+            </w:r>
+            <w:r>
+              <w:rPr>
+                <w:rFonts w:ascii="David" w:cs="David" w:eastAsia="David" w:hAnsi="David"/>
+                <w:sz w:val="24"/>
+                <w:szCs w:val="24"/>
+                <w:rtl w:val="1"/>
+              </w:rPr>
+              <w:t xml:space="preserve">להכנה</w:t>
+            </w:r>
+            <w:r>
+              <w:rPr>
+                <w:rFonts w:ascii="David" w:cs="David" w:eastAsia="David" w:hAnsi="David"/>
+                <w:sz w:val="24"/>
+                <w:szCs w:val="24"/>
+                <w:rtl w:val="1"/>
+              </w:rPr>
+              <w:t xml:space="preserve">:</w:t>
+              <w:br w:type="textWrapping"/>
+              <w:t xml:space="preserve">• </w:t>
+            </w:r>
+            <w:r>
+              <w:rPr>
+                <w:rFonts w:ascii="David" w:cs="David" w:eastAsia="David" w:hAnsi="David"/>
+                <w:sz w:val="24"/>
+                <w:szCs w:val="24"/>
+                <w:rtl w:val="1"/>
+              </w:rPr>
+              <w:t xml:space="preserve">תבניות</w:t>
+            </w:r>
+            <w:r>
+              <w:rPr>
+                <w:rFonts w:ascii="David" w:cs="David" w:eastAsia="David" w:hAnsi="David"/>
+                <w:sz w:val="24"/>
+                <w:szCs w:val="24"/>
+                <w:rtl w:val="1"/>
+              </w:rPr>
+              <w:t xml:space="preserve"> </w:t>
+            </w:r>
+            <w:r>
+              <w:rPr>
+                <w:rFonts w:ascii="David" w:cs="David" w:eastAsia="David" w:hAnsi="David"/>
+                <w:sz w:val="24"/>
+                <w:szCs w:val="24"/>
+                <w:rtl w:val="1"/>
+              </w:rPr>
+              <w:t xml:space="preserve">עשר</w:t>
+            </w:r>
+            <w:r>
+              <w:rPr>
+                <w:rFonts w:ascii="David" w:cs="David" w:eastAsia="David" w:hAnsi="David"/>
+                <w:sz w:val="24"/>
+                <w:szCs w:val="24"/>
+                <w:rtl w:val="1"/>
+              </w:rPr>
+              <w:t xml:space="preserve"> (</w:t>
+            </w:r>
+            <w:r>
+              <w:rPr>
+                <w:rFonts w:ascii="David" w:cs="David" w:eastAsia="David" w:hAnsi="David"/>
+                <w:sz w:val="24"/>
+                <w:szCs w:val="24"/>
+                <w:rtl w:val="1"/>
+              </w:rPr>
+              <w:t xml:space="preserve">לוחות</w:t>
+            </w:r>
+            <w:r>
+              <w:rPr>
+                <w:rFonts w:ascii="David" w:cs="David" w:eastAsia="David" w:hAnsi="David"/>
+                <w:sz w:val="24"/>
+                <w:szCs w:val="24"/>
+                <w:rtl w:val="1"/>
+              </w:rPr>
+              <w:t xml:space="preserve"> 10) </w:t>
+            </w:r>
+            <w:r>
+              <w:rPr>
+                <w:rFonts w:ascii="David" w:cs="David" w:eastAsia="David" w:hAnsi="David"/>
+                <w:sz w:val="24"/>
+                <w:szCs w:val="24"/>
+                <w:rtl w:val="1"/>
+              </w:rPr>
+              <w:t xml:space="preserve">ודסקיות</w:t>
+            </w:r>
+            <w:r>
+              <w:rPr>
+                <w:rFonts w:ascii="David" w:cs="David" w:eastAsia="David" w:hAnsi="David"/>
+                <w:sz w:val="24"/>
+                <w:szCs w:val="24"/>
+                <w:rtl w:val="1"/>
+              </w:rPr>
+              <w:t xml:space="preserve">.</w:t>
+              <w:br w:type="textWrapping"/>
+              <w:t xml:space="preserve">• </w:t>
+            </w:r>
+            <w:r>
+              <w:rPr>
+                <w:rFonts w:ascii="David" w:cs="David" w:eastAsia="David" w:hAnsi="David"/>
+                <w:sz w:val="24"/>
+                <w:szCs w:val="24"/>
+                <w:rtl w:val="1"/>
+              </w:rPr>
+              <w:t xml:space="preserve">לוח</w:t>
+            </w:r>
+            <w:r>
+              <w:rPr>
+                <w:rFonts w:ascii="David" w:cs="David" w:eastAsia="David" w:hAnsi="David"/>
+                <w:sz w:val="24"/>
+                <w:szCs w:val="24"/>
+                <w:rtl w:val="1"/>
+              </w:rPr>
+              <w:t xml:space="preserve"> </w:t>
+            </w:r>
+            <w:r>
+              <w:rPr>
+                <w:rFonts w:ascii="David" w:cs="David" w:eastAsia="David" w:hAnsi="David"/>
+                <w:sz w:val="24"/>
+                <w:szCs w:val="24"/>
+                <w:rtl w:val="1"/>
+              </w:rPr>
+              <w:t xml:space="preserve">המאה</w:t>
+            </w:r>
+            <w:r>
+              <w:rPr>
+                <w:rFonts w:ascii="David" w:cs="David" w:eastAsia="David" w:hAnsi="David"/>
+                <w:sz w:val="24"/>
+                <w:szCs w:val="24"/>
+                <w:rtl w:val="1"/>
+              </w:rPr>
+              <w:t xml:space="preserve">.</w:t>
+              <w:br w:type="textWrapping"/>
+              <w:t xml:space="preserve">• </w:t>
+            </w:r>
+            <w:r>
+              <w:rPr>
+                <w:rFonts w:ascii="David" w:cs="David" w:eastAsia="David" w:hAnsi="David"/>
+                <w:sz w:val="24"/>
+                <w:szCs w:val="24"/>
+                <w:rtl w:val="1"/>
+              </w:rPr>
+              <w:t xml:space="preserve">צלחת</w:t>
+            </w:r>
+            <w:r>
+              <w:rPr>
+                <w:rFonts w:ascii="David" w:cs="David" w:eastAsia="David" w:hAnsi="David"/>
+                <w:sz w:val="24"/>
+                <w:szCs w:val="24"/>
+                <w:rtl w:val="1"/>
+              </w:rPr>
+              <w:t xml:space="preserve"> </w:t>
+            </w:r>
+            <w:r>
+              <w:rPr>
+                <w:rFonts w:ascii="David" w:cs="David" w:eastAsia="David" w:hAnsi="David"/>
+                <w:sz w:val="24"/>
+                <w:szCs w:val="24"/>
+                <w:rtl w:val="1"/>
+              </w:rPr>
+              <w:t xml:space="preserve">פלסטיק</w:t>
+            </w:r>
+            <w:r>
+              <w:rPr>
+                <w:rFonts w:ascii="David" w:cs="David" w:eastAsia="David" w:hAnsi="David"/>
+                <w:sz w:val="24"/>
+                <w:szCs w:val="24"/>
+                <w:rtl w:val="1"/>
+              </w:rPr>
+              <w:t xml:space="preserve">, </w:t>
+            </w:r>
+            <w:r>
+              <w:rPr>
+                <w:rFonts w:ascii="David" w:cs="David" w:eastAsia="David" w:hAnsi="David"/>
+                <w:sz w:val="24"/>
+                <w:szCs w:val="24"/>
+                <w:rtl w:val="1"/>
+              </w:rPr>
+              <w:t xml:space="preserve">פריטים</w:t>
+            </w:r>
+            <w:r>
+              <w:rPr>
+                <w:rFonts w:ascii="David" w:cs="David" w:eastAsia="David" w:hAnsi="David"/>
+                <w:sz w:val="24"/>
+                <w:szCs w:val="24"/>
+                <w:rtl w:val="1"/>
+              </w:rPr>
+              <w:t xml:space="preserve"> </w:t>
+            </w:r>
+            <w:r>
+              <w:rPr>
+                <w:rFonts w:ascii="David" w:cs="David" w:eastAsia="David" w:hAnsi="David"/>
+                <w:sz w:val="24"/>
+                <w:szCs w:val="24"/>
+                <w:rtl w:val="1"/>
+              </w:rPr>
+              <w:t xml:space="preserve">למנייה</w:t>
+            </w:r>
+            <w:r>
+              <w:rPr>
+                <w:rFonts w:ascii="David" w:cs="David" w:eastAsia="David" w:hAnsi="David"/>
+                <w:sz w:val="24"/>
+                <w:szCs w:val="24"/>
+                <w:rtl w:val="1"/>
+              </w:rPr>
+              <w:t xml:space="preserve"> </w:t>
+            </w:r>
+            <w:r>
+              <w:rPr>
+                <w:rFonts w:ascii="David" w:cs="David" w:eastAsia="David" w:hAnsi="David"/>
+                <w:sz w:val="24"/>
+                <w:szCs w:val="24"/>
+                <w:rtl w:val="1"/>
+              </w:rPr>
+              <w:t xml:space="preserve">וכרטיסיות</w:t>
+            </w:r>
+            <w:r>
+              <w:rPr>
+                <w:rFonts w:ascii="David" w:cs="David" w:eastAsia="David" w:hAnsi="David"/>
+                <w:sz w:val="24"/>
+                <w:szCs w:val="24"/>
+                <w:rtl w:val="1"/>
+              </w:rPr>
+              <w:t xml:space="preserve">.</w:t>
+            </w:r>
+            <w:r>
+              <w:rPr>
+                <w:rtl w:val="0"/>
+              </w:rPr>
+            </w:r>
+          </w:p>
+          <w:p>
+            <w:pPr>
+              <w:bidi w:val="1"/>
+              <w:rPr/>
+            </w:pPr>
             <w:r>
               <w:rPr>
                 <w:rtl w:val="0"/>
@@ -6965,30 +7544,17 @@
             <w:bookmarkEnd w:id="5"/>
             <w:r>
               <w:rPr>
-                <w:rtl w:val="0"/>
-              </w:rPr>
-            </w:r>
-            <w:r>
-              <w:rPr>
-                <w:rFonts w:ascii="David" w:cs="David" w:eastAsia="David" w:hAnsi="David"/>
-                <w:b w:val="1"/>
-                <w:bCs w:val="1"/>
+                <w:rFonts w:ascii="David" w:cs="David" w:eastAsia="David" w:hAnsi="David"/>
                 <w:sz w:val="28"/>
                 <w:szCs w:val="28"/>
-                <w:rtl w:val="1"/>
-              </w:rPr>
-              <w:t xml:space="preserve">4</w:t>
-            </w:r>
-            <w:r>
-              <w:rPr>
-                <w:rFonts w:ascii="David" w:cs="David" w:eastAsia="David" w:hAnsi="David"/>
-                <w:b w:val="1"/>
-                <w:bCs w:val="1"/>
-                <w:sz w:val="28"/>
-                <w:szCs w:val="28"/>
-                <w:rtl w:val="1"/>
-              </w:rPr>
-              <w:t xml:space="preserve">ת</w:t>
+                <w:rtl w:val="0"/>
+              </w:rPr>
+              <w:t xml:space="preserve">2</w:t>
+            </w:r>
+            <w:r>
+              <w:rPr>
+                <w:rtl w:val="0"/>
+              </w:rPr>
             </w:r>
             <w:r>
               <w:rPr>
@@ -7755,6 +8321,15 @@
             <w:bookmarkEnd w:id="6"/>
             <w:r>
               <w:rPr>
+                <w:rFonts w:ascii="David" w:cs="David" w:eastAsia="David" w:hAnsi="David"/>
+                <w:sz w:val="28"/>
+                <w:szCs w:val="28"/>
+                <w:rtl w:val="0"/>
+              </w:rPr>
+              <w:t xml:space="preserve">2</w:t>
+            </w:r>
+            <w:r>
+              <w:rPr>
                 <w:rtl w:val="0"/>
               </w:rPr>
             </w:r>
@@ -7767,7 +8342,7 @@
                 <w:szCs w:val="28"/>
                 <w:rtl w:val="1"/>
               </w:rPr>
-              <w:t xml:space="preserve">4. </w:t>
+              <w:t xml:space="preserve">. </w:t>
             </w:r>
             <w:r>
               <w:rPr>
@@ -9314,60 +9889,6 @@
                 <w:szCs w:val="24"/>
                 <w:rtl w:val="1"/>
               </w:rPr>
-              <w:t xml:space="preserve">המערכת</w:t>
-            </w:r>
-            <w:r>
-              <w:rPr>
-                <w:rFonts w:ascii="David" w:cs="David" w:eastAsia="David" w:hAnsi="David"/>
-                <w:sz w:val="24"/>
-                <w:szCs w:val="24"/>
-                <w:rtl w:val="1"/>
-              </w:rPr>
-              <w:t xml:space="preserve"> </w:t>
-            </w:r>
-            <w:r>
-              <w:rPr>
-                <w:rFonts w:ascii="David" w:cs="David" w:eastAsia="David" w:hAnsi="David"/>
-                <w:sz w:val="24"/>
-                <w:szCs w:val="24"/>
-                <w:rtl w:val="1"/>
-              </w:rPr>
-              <w:t xml:space="preserve">תעלים</w:t>
-            </w:r>
-            <w:r>
-              <w:rPr>
-                <w:rFonts w:ascii="David" w:cs="David" w:eastAsia="David" w:hAnsi="David"/>
-                <w:sz w:val="24"/>
-                <w:szCs w:val="24"/>
-                <w:rtl w:val="1"/>
-              </w:rPr>
-              <w:t xml:space="preserve"> </w:t>
-            </w:r>
-            <w:r>
-              <w:rPr>
-                <w:rFonts w:ascii="David" w:cs="David" w:eastAsia="David" w:hAnsi="David"/>
-                <w:sz w:val="24"/>
-                <w:szCs w:val="24"/>
-                <w:rtl w:val="1"/>
-              </w:rPr>
-              <w:t xml:space="preserve">את</w:t>
-            </w:r>
-            <w:r>
-              <w:rPr>
-                <w:rFonts w:ascii="David" w:cs="David" w:eastAsia="David" w:hAnsi="David"/>
-                <w:sz w:val="24"/>
-                <w:szCs w:val="24"/>
-                <w:rtl w:val="1"/>
-              </w:rPr>
-              <w:t xml:space="preserve"> </w:t>
-            </w:r>
-            <w:r>
-              <w:rPr>
-                <w:rFonts w:ascii="David" w:cs="David" w:eastAsia="David" w:hAnsi="David"/>
-                <w:sz w:val="24"/>
-                <w:szCs w:val="24"/>
-                <w:rtl w:val="1"/>
-              </w:rPr>
               <w:t xml:space="preserve">הלוח</w:t>
             </w:r>
             <w:r>
@@ -9386,259 +9907,7 @@
                 <w:szCs w:val="24"/>
                 <w:rtl w:val="1"/>
               </w:rPr>
-              <w:t xml:space="preserve">באופן</w:t>
-            </w:r>
-            <w:r>
-              <w:rPr>
-                <w:rFonts w:ascii="David" w:cs="David" w:eastAsia="David" w:hAnsi="David"/>
-                <w:sz w:val="24"/>
-                <w:szCs w:val="24"/>
-                <w:rtl w:val="1"/>
-              </w:rPr>
-              <w:t xml:space="preserve"> </w:t>
-            </w:r>
-            <w:r>
-              <w:rPr>
-                <w:rFonts w:ascii="David" w:cs="David" w:eastAsia="David" w:hAnsi="David"/>
-                <w:sz w:val="24"/>
-                <w:szCs w:val="24"/>
-                <w:rtl w:val="1"/>
-              </w:rPr>
-              <w:t xml:space="preserve">אוטומטי</w:t>
-            </w:r>
-            <w:r>
-              <w:rPr>
-                <w:rFonts w:ascii="David" w:cs="David" w:eastAsia="David" w:hAnsi="David"/>
-                <w:sz w:val="24"/>
-                <w:szCs w:val="24"/>
-                <w:rtl w:val="1"/>
-              </w:rPr>
-              <w:t xml:space="preserve"> </w:t>
-            </w:r>
-            <w:r>
-              <w:rPr>
-                <w:rFonts w:ascii="David" w:cs="David" w:eastAsia="David" w:hAnsi="David"/>
-                <w:sz w:val="24"/>
-                <w:szCs w:val="24"/>
-                <w:rtl w:val="1"/>
-              </w:rPr>
-              <w:t xml:space="preserve">בדיוק</w:t>
-            </w:r>
-            <w:r>
-              <w:rPr>
-                <w:rFonts w:ascii="David" w:cs="David" w:eastAsia="David" w:hAnsi="David"/>
-                <w:sz w:val="24"/>
-                <w:szCs w:val="24"/>
-                <w:rtl w:val="1"/>
-              </w:rPr>
-              <w:t xml:space="preserve"> </w:t>
-            </w:r>
-            <w:r>
-              <w:rPr>
-                <w:rFonts w:ascii="David" w:cs="David" w:eastAsia="David" w:hAnsi="David"/>
-                <w:sz w:val="24"/>
-                <w:szCs w:val="24"/>
-                <w:rtl w:val="1"/>
-              </w:rPr>
-              <w:t xml:space="preserve">שלוש</w:t>
-            </w:r>
-            <w:r>
-              <w:rPr>
-                <w:rFonts w:ascii="David" w:cs="David" w:eastAsia="David" w:hAnsi="David"/>
-                <w:sz w:val="24"/>
-                <w:szCs w:val="24"/>
-                <w:rtl w:val="1"/>
-              </w:rPr>
-              <w:t xml:space="preserve"> </w:t>
-            </w:r>
-            <w:r>
-              <w:rPr>
-                <w:rFonts w:ascii="David" w:cs="David" w:eastAsia="David" w:hAnsi="David"/>
-                <w:sz w:val="24"/>
-                <w:szCs w:val="24"/>
-                <w:rtl w:val="1"/>
-              </w:rPr>
-              <w:t xml:space="preserve">שניות</w:t>
-            </w:r>
-            <w:r>
-              <w:rPr>
-                <w:rFonts w:ascii="David" w:cs="David" w:eastAsia="David" w:hAnsi="David"/>
-                <w:sz w:val="24"/>
-                <w:szCs w:val="24"/>
-                <w:rtl w:val="1"/>
-              </w:rPr>
-              <w:t xml:space="preserve"> </w:t>
-            </w:r>
-            <w:r>
-              <w:rPr>
-                <w:rFonts w:ascii="David" w:cs="David" w:eastAsia="David" w:hAnsi="David"/>
-                <w:sz w:val="24"/>
-                <w:szCs w:val="24"/>
-                <w:rtl w:val="1"/>
-              </w:rPr>
-              <w:t xml:space="preserve">לאחר</w:t>
-            </w:r>
-            <w:r>
-              <w:rPr>
-                <w:rFonts w:ascii="David" w:cs="David" w:eastAsia="David" w:hAnsi="David"/>
-                <w:sz w:val="24"/>
-                <w:szCs w:val="24"/>
-                <w:rtl w:val="1"/>
-              </w:rPr>
-              <w:t xml:space="preserve"> </w:t>
-            </w:r>
-            <w:r>
-              <w:rPr>
-                <w:rFonts w:ascii="David" w:cs="David" w:eastAsia="David" w:hAnsi="David"/>
-                <w:sz w:val="24"/>
-                <w:szCs w:val="24"/>
-                <w:rtl w:val="1"/>
-              </w:rPr>
-              <w:t xml:space="preserve">זיהוי</w:t>
-            </w:r>
-            <w:r>
-              <w:rPr>
-                <w:rFonts w:ascii="David" w:cs="David" w:eastAsia="David" w:hAnsi="David"/>
-                <w:sz w:val="24"/>
-                <w:szCs w:val="24"/>
-                <w:rtl w:val="1"/>
-              </w:rPr>
-              <w:t xml:space="preserve"> </w:t>
-            </w:r>
-            <w:r>
-              <w:rPr>
-                <w:rFonts w:ascii="David" w:cs="David" w:eastAsia="David" w:hAnsi="David"/>
-                <w:sz w:val="24"/>
-                <w:szCs w:val="24"/>
-                <w:rtl w:val="1"/>
-              </w:rPr>
-              <w:t xml:space="preserve">אירוע</w:t>
-            </w:r>
-            <w:r>
-              <w:rPr>
-                <w:rFonts w:ascii="David" w:cs="David" w:eastAsia="David" w:hAnsi="David"/>
-                <w:sz w:val="24"/>
-                <w:szCs w:val="24"/>
-                <w:rtl w:val="1"/>
-              </w:rPr>
-              <w:t xml:space="preserve"> </w:t>
-            </w:r>
-            <w:r>
-              <w:rPr>
-                <w:rFonts w:ascii="David" w:cs="David" w:eastAsia="David" w:hAnsi="David"/>
-                <w:sz w:val="24"/>
-                <w:szCs w:val="24"/>
-                <w:rtl w:val="1"/>
-              </w:rPr>
-              <w:t xml:space="preserve">קלט</w:t>
-            </w:r>
-            <w:r>
-              <w:rPr>
-                <w:rFonts w:ascii="David" w:cs="David" w:eastAsia="David" w:hAnsi="David"/>
-                <w:sz w:val="24"/>
-                <w:szCs w:val="24"/>
-                <w:rtl w:val="1"/>
-              </w:rPr>
-              <w:t xml:space="preserve"> </w:t>
-            </w:r>
-            <w:r>
-              <w:rPr>
-                <w:rFonts w:ascii="David" w:cs="David" w:eastAsia="David" w:hAnsi="David"/>
-                <w:sz w:val="24"/>
-                <w:szCs w:val="24"/>
-                <w:rtl w:val="1"/>
-              </w:rPr>
-              <w:t xml:space="preserve">מוצלח</w:t>
-            </w:r>
-            <w:r>
-              <w:rPr>
-                <w:rFonts w:ascii="David" w:cs="David" w:eastAsia="David" w:hAnsi="David"/>
-                <w:sz w:val="24"/>
-                <w:szCs w:val="24"/>
-                <w:rtl w:val="1"/>
-              </w:rPr>
-              <w:t xml:space="preserve"> </w:t>
-            </w:r>
-            <w:r>
-              <w:rPr>
-                <w:rFonts w:ascii="David" w:cs="David" w:eastAsia="David" w:hAnsi="David"/>
-                <w:sz w:val="24"/>
-                <w:szCs w:val="24"/>
-                <w:rtl w:val="1"/>
-              </w:rPr>
-              <w:t xml:space="preserve">של</w:t>
-            </w:r>
-            <w:r>
-              <w:rPr>
-                <w:rFonts w:ascii="David" w:cs="David" w:eastAsia="David" w:hAnsi="David"/>
-                <w:sz w:val="24"/>
-                <w:szCs w:val="24"/>
-                <w:rtl w:val="1"/>
-              </w:rPr>
-              <w:t xml:space="preserve"> </w:t>
-            </w:r>
-            <w:r>
-              <w:rPr>
-                <w:rFonts w:ascii="David" w:cs="David" w:eastAsia="David" w:hAnsi="David"/>
-                <w:sz w:val="24"/>
-                <w:szCs w:val="24"/>
-                <w:rtl w:val="1"/>
-              </w:rPr>
-              <w:t xml:space="preserve">בחירת</w:t>
-            </w:r>
-            <w:r>
-              <w:rPr>
-                <w:rFonts w:ascii="David" w:cs="David" w:eastAsia="David" w:hAnsi="David"/>
-                <w:sz w:val="24"/>
-                <w:szCs w:val="24"/>
-                <w:rtl w:val="1"/>
-              </w:rPr>
-              <w:t xml:space="preserve"> </w:t>
-            </w:r>
-            <w:r>
-              <w:rPr>
-                <w:rFonts w:ascii="David" w:cs="David" w:eastAsia="David" w:hAnsi="David"/>
-                <w:sz w:val="24"/>
-                <w:szCs w:val="24"/>
-                <w:rtl w:val="1"/>
-              </w:rPr>
-              <w:t xml:space="preserve">ספרה</w:t>
-            </w:r>
-            <w:r>
-              <w:rPr>
-                <w:rFonts w:ascii="David" w:cs="David" w:eastAsia="David" w:hAnsi="David"/>
-                <w:sz w:val="24"/>
-                <w:szCs w:val="24"/>
-                <w:rtl w:val="1"/>
-              </w:rPr>
-              <w:t xml:space="preserve"> </w:t>
-            </w:r>
-            <w:r>
-              <w:rPr>
-                <w:rFonts w:ascii="David" w:cs="David" w:eastAsia="David" w:hAnsi="David"/>
-                <w:sz w:val="24"/>
-                <w:szCs w:val="24"/>
-                <w:rtl w:val="1"/>
-              </w:rPr>
-              <w:t xml:space="preserve">או</w:t>
-            </w:r>
-            <w:r>
-              <w:rPr>
-                <w:rFonts w:ascii="David" w:cs="David" w:eastAsia="David" w:hAnsi="David"/>
-                <w:sz w:val="24"/>
-                <w:szCs w:val="24"/>
-                <w:rtl w:val="1"/>
-              </w:rPr>
-              <w:t xml:space="preserve"> </w:t>
-            </w:r>
-            <w:r>
-              <w:rPr>
-                <w:rFonts w:ascii="David" w:cs="David" w:eastAsia="David" w:hAnsi="David"/>
-                <w:sz w:val="24"/>
-                <w:szCs w:val="24"/>
-                <w:rtl w:val="1"/>
-              </w:rPr>
-              <w:t xml:space="preserve">תשובה</w:t>
+              <w:t xml:space="preserve">יישאר</w:t>
             </w:r>
             <w:r>
               <w:rPr>
@@ -9674,34 +9943,178 @@
                 <w:szCs w:val="24"/>
                 <w:rtl w:val="1"/>
               </w:rPr>
-              <w:t xml:space="preserve">ידי</w:t>
-            </w:r>
-            <w:r>
-              <w:rPr>
-                <w:rFonts w:ascii="David" w:cs="David" w:eastAsia="David" w:hAnsi="David"/>
-                <w:sz w:val="24"/>
-                <w:szCs w:val="24"/>
-                <w:rtl w:val="1"/>
-              </w:rPr>
-              <w:t xml:space="preserve"> </w:t>
-            </w:r>
-            <w:r>
-              <w:rPr>
-                <w:rFonts w:ascii="David" w:cs="David" w:eastAsia="David" w:hAnsi="David"/>
-                <w:sz w:val="24"/>
-                <w:szCs w:val="24"/>
-                <w:rtl w:val="1"/>
-              </w:rPr>
-              <w:t xml:space="preserve">הלומד</w:t>
-            </w:r>
-            <w:r>
-              <w:rPr>
-                <w:rFonts w:ascii="David" w:cs="David" w:eastAsia="David" w:hAnsi="David"/>
-                <w:sz w:val="24"/>
-                <w:szCs w:val="24"/>
-                <w:rtl w:val="1"/>
-              </w:rPr>
-              <w:t xml:space="preserve"> </w:t>
+              <w:t xml:space="preserve">המסך</w:t>
+            </w:r>
+            <w:r>
+              <w:rPr>
+                <w:rFonts w:ascii="David" w:cs="David" w:eastAsia="David" w:hAnsi="David"/>
+                <w:sz w:val="24"/>
+                <w:szCs w:val="24"/>
+                <w:rtl w:val="1"/>
+              </w:rPr>
+              <w:t xml:space="preserve"> </w:t>
+            </w:r>
+            <w:r>
+              <w:rPr>
+                <w:rFonts w:ascii="David" w:cs="David" w:eastAsia="David" w:hAnsi="David"/>
+                <w:sz w:val="24"/>
+                <w:szCs w:val="24"/>
+                <w:rtl w:val="1"/>
+              </w:rPr>
+              <w:t xml:space="preserve">עד</w:t>
+            </w:r>
+            <w:r>
+              <w:rPr>
+                <w:rFonts w:ascii="David" w:cs="David" w:eastAsia="David" w:hAnsi="David"/>
+                <w:sz w:val="24"/>
+                <w:szCs w:val="24"/>
+                <w:rtl w:val="1"/>
+              </w:rPr>
+              <w:t xml:space="preserve"> </w:t>
+            </w:r>
+            <w:r>
+              <w:rPr>
+                <w:rFonts w:ascii="David" w:cs="David" w:eastAsia="David" w:hAnsi="David"/>
+                <w:sz w:val="24"/>
+                <w:szCs w:val="24"/>
+                <w:rtl w:val="1"/>
+              </w:rPr>
+              <w:t xml:space="preserve">שהלומד</w:t>
+            </w:r>
+            <w:r>
+              <w:rPr>
+                <w:rFonts w:ascii="David" w:cs="David" w:eastAsia="David" w:hAnsi="David"/>
+                <w:sz w:val="24"/>
+                <w:szCs w:val="24"/>
+                <w:rtl w:val="1"/>
+              </w:rPr>
+              <w:t xml:space="preserve"> </w:t>
+            </w:r>
+            <w:r>
+              <w:rPr>
+                <w:rFonts w:ascii="David" w:cs="David" w:eastAsia="David" w:hAnsi="David"/>
+                <w:sz w:val="24"/>
+                <w:szCs w:val="24"/>
+                <w:rtl w:val="1"/>
+              </w:rPr>
+              <w:t xml:space="preserve">יסגור</w:t>
+            </w:r>
+            <w:r>
+              <w:rPr>
+                <w:rFonts w:ascii="David" w:cs="David" w:eastAsia="David" w:hAnsi="David"/>
+                <w:sz w:val="24"/>
+                <w:szCs w:val="24"/>
+                <w:rtl w:val="1"/>
+              </w:rPr>
+              <w:t xml:space="preserve"> </w:t>
+            </w:r>
+            <w:r>
+              <w:rPr>
+                <w:rFonts w:ascii="David" w:cs="David" w:eastAsia="David" w:hAnsi="David"/>
+                <w:sz w:val="24"/>
+                <w:szCs w:val="24"/>
+                <w:rtl w:val="1"/>
+              </w:rPr>
+              <w:t xml:space="preserve">אותו</w:t>
+            </w:r>
+            <w:r>
+              <w:rPr>
+                <w:rFonts w:ascii="David" w:cs="David" w:eastAsia="David" w:hAnsi="David"/>
+                <w:sz w:val="24"/>
+                <w:szCs w:val="24"/>
+                <w:rtl w:val="1"/>
+              </w:rPr>
+              <w:t xml:space="preserve"> </w:t>
+            </w:r>
+            <w:r>
+              <w:rPr>
+                <w:rFonts w:ascii="David" w:cs="David" w:eastAsia="David" w:hAnsi="David"/>
+                <w:sz w:val="24"/>
+                <w:szCs w:val="24"/>
+                <w:rtl w:val="1"/>
+              </w:rPr>
+              <w:t xml:space="preserve">בעצמו</w:t>
+            </w:r>
+            <w:r>
+              <w:rPr>
+                <w:rFonts w:ascii="David" w:cs="David" w:eastAsia="David" w:hAnsi="David"/>
+                <w:sz w:val="24"/>
+                <w:szCs w:val="24"/>
+                <w:rtl w:val="1"/>
+              </w:rPr>
+              <w:t xml:space="preserve"> </w:t>
+            </w:r>
+            <w:r>
+              <w:rPr>
+                <w:rFonts w:ascii="David" w:cs="David" w:eastAsia="David" w:hAnsi="David"/>
+                <w:sz w:val="24"/>
+                <w:szCs w:val="24"/>
+                <w:rtl w:val="1"/>
+              </w:rPr>
+              <w:t xml:space="preserve">בלחיצה</w:t>
+            </w:r>
+            <w:r>
+              <w:rPr>
+                <w:rFonts w:ascii="David" w:cs="David" w:eastAsia="David" w:hAnsi="David"/>
+                <w:sz w:val="24"/>
+                <w:szCs w:val="24"/>
+                <w:rtl w:val="1"/>
+              </w:rPr>
+              <w:t xml:space="preserve"> </w:t>
+            </w:r>
+            <w:r>
+              <w:rPr>
+                <w:rFonts w:ascii="David" w:cs="David" w:eastAsia="David" w:hAnsi="David"/>
+                <w:sz w:val="24"/>
+                <w:szCs w:val="24"/>
+                <w:rtl w:val="1"/>
+              </w:rPr>
+              <w:t xml:space="preserve">על</w:t>
+            </w:r>
+            <w:r>
+              <w:rPr>
+                <w:rFonts w:ascii="David" w:cs="David" w:eastAsia="David" w:hAnsi="David"/>
+                <w:sz w:val="24"/>
+                <w:szCs w:val="24"/>
+                <w:rtl w:val="1"/>
+              </w:rPr>
+              <w:t xml:space="preserve"> </w:t>
+            </w:r>
+            <w:r>
+              <w:rPr>
+                <w:rFonts w:ascii="David" w:cs="David" w:eastAsia="David" w:hAnsi="David"/>
+                <w:sz w:val="24"/>
+                <w:szCs w:val="24"/>
+                <w:rtl w:val="1"/>
+              </w:rPr>
+              <w:t xml:space="preserve">כפתור</w:t>
+            </w:r>
+            <w:r>
+              <w:rPr>
+                <w:rFonts w:ascii="David" w:cs="David" w:eastAsia="David" w:hAnsi="David"/>
+                <w:sz w:val="24"/>
+                <w:szCs w:val="24"/>
+                <w:rtl w:val="1"/>
+              </w:rPr>
+              <w:t xml:space="preserve"> </w:t>
+            </w:r>
+            <w:r>
+              <w:rPr>
+                <w:rFonts w:ascii="David" w:cs="David" w:eastAsia="David" w:hAnsi="David"/>
+                <w:sz w:val="24"/>
+                <w:szCs w:val="24"/>
+                <w:rtl w:val="1"/>
+              </w:rPr>
+              <w:t xml:space="preserve">הסגירה</w:t>
+            </w:r>
+            <w:r>
+              <w:rPr>
+                <w:rFonts w:ascii="David" w:cs="David" w:eastAsia="David" w:hAnsi="David"/>
+                <w:sz w:val="24"/>
+                <w:szCs w:val="24"/>
+                <w:rtl w:val="1"/>
+              </w:rPr>
+              <w:t xml:space="preserve">, </w:t>
             </w:r>
             <w:r>
               <w:rPr>
@@ -9728,133 +10141,133 @@
                 <w:szCs w:val="24"/>
                 <w:rtl w:val="1"/>
               </w:rPr>
-              <w:t xml:space="preserve">למנוע</w:t>
-            </w:r>
-            <w:r>
-              <w:rPr>
-                <w:rFonts w:ascii="David" w:cs="David" w:eastAsia="David" w:hAnsi="David"/>
-                <w:sz w:val="24"/>
-                <w:szCs w:val="24"/>
-                <w:rtl w:val="1"/>
-              </w:rPr>
-              <w:t xml:space="preserve"> </w:t>
-            </w:r>
-            <w:r>
-              <w:rPr>
-                <w:rFonts w:ascii="David" w:cs="David" w:eastAsia="David" w:hAnsi="David"/>
-                <w:sz w:val="24"/>
-                <w:szCs w:val="24"/>
-                <w:rtl w:val="1"/>
-              </w:rPr>
-              <w:t xml:space="preserve">עומס</w:t>
-            </w:r>
-            <w:r>
-              <w:rPr>
-                <w:rFonts w:ascii="David" w:cs="David" w:eastAsia="David" w:hAnsi="David"/>
-                <w:sz w:val="24"/>
-                <w:szCs w:val="24"/>
-                <w:rtl w:val="1"/>
-              </w:rPr>
-              <w:t xml:space="preserve"> </w:t>
-            </w:r>
-            <w:r>
-              <w:rPr>
-                <w:rFonts w:ascii="David" w:cs="David" w:eastAsia="David" w:hAnsi="David"/>
-                <w:sz w:val="24"/>
-                <w:szCs w:val="24"/>
-                <w:rtl w:val="1"/>
-              </w:rPr>
-              <w:t xml:space="preserve">חזותי</w:t>
-            </w:r>
-            <w:r>
-              <w:rPr>
-                <w:rFonts w:ascii="David" w:cs="David" w:eastAsia="David" w:hAnsi="David"/>
-                <w:sz w:val="24"/>
-                <w:szCs w:val="24"/>
-                <w:rtl w:val="1"/>
-              </w:rPr>
-              <w:t xml:space="preserve"> </w:t>
-            </w:r>
-            <w:r>
-              <w:rPr>
-                <w:rFonts w:ascii="David" w:cs="David" w:eastAsia="David" w:hAnsi="David"/>
-                <w:sz w:val="24"/>
-                <w:szCs w:val="24"/>
-                <w:rtl w:val="1"/>
-              </w:rPr>
-              <w:t xml:space="preserve">אצל</w:t>
-            </w:r>
-            <w:r>
-              <w:rPr>
-                <w:rFonts w:ascii="David" w:cs="David" w:eastAsia="David" w:hAnsi="David"/>
-                <w:sz w:val="24"/>
-                <w:szCs w:val="24"/>
-                <w:rtl w:val="1"/>
-              </w:rPr>
-              <w:t xml:space="preserve"> </w:t>
-            </w:r>
-            <w:r>
-              <w:rPr>
-                <w:rFonts w:ascii="David" w:cs="David" w:eastAsia="David" w:hAnsi="David"/>
-                <w:sz w:val="24"/>
-                <w:szCs w:val="24"/>
-                <w:rtl w:val="1"/>
-              </w:rPr>
-              <w:t xml:space="preserve">לומדים</w:t>
-            </w:r>
-            <w:r>
-              <w:rPr>
-                <w:rFonts w:ascii="David" w:cs="David" w:eastAsia="David" w:hAnsi="David"/>
-                <w:sz w:val="24"/>
-                <w:szCs w:val="24"/>
-                <w:rtl w:val="1"/>
-              </w:rPr>
-              <w:t xml:space="preserve"> </w:t>
-            </w:r>
-            <w:r>
-              <w:rPr>
-                <w:rFonts w:ascii="David" w:cs="David" w:eastAsia="David" w:hAnsi="David"/>
-                <w:sz w:val="24"/>
-                <w:szCs w:val="24"/>
-                <w:rtl w:val="1"/>
-              </w:rPr>
-              <w:t xml:space="preserve">על</w:t>
-            </w:r>
-            <w:r>
-              <w:rPr>
-                <w:rFonts w:ascii="David" w:cs="David" w:eastAsia="David" w:hAnsi="David"/>
-                <w:sz w:val="24"/>
-                <w:szCs w:val="24"/>
-                <w:rtl w:val="1"/>
-              </w:rPr>
-              <w:t xml:space="preserve"> </w:t>
-            </w:r>
-            <w:r>
-              <w:rPr>
-                <w:rFonts w:ascii="David" w:cs="David" w:eastAsia="David" w:hAnsi="David"/>
-                <w:sz w:val="24"/>
-                <w:szCs w:val="24"/>
-                <w:rtl w:val="1"/>
-              </w:rPr>
-              <w:t xml:space="preserve">הרצף</w:t>
-            </w:r>
-            <w:r>
-              <w:rPr>
-                <w:rFonts w:ascii="David" w:cs="David" w:eastAsia="David" w:hAnsi="David"/>
-                <w:sz w:val="24"/>
-                <w:szCs w:val="24"/>
-                <w:rtl w:val="1"/>
-              </w:rPr>
-              <w:t xml:space="preserve"> </w:t>
-            </w:r>
-            <w:r>
-              <w:rPr>
-                <w:rFonts w:ascii="David" w:cs="David" w:eastAsia="David" w:hAnsi="David"/>
-                <w:sz w:val="24"/>
-                <w:szCs w:val="24"/>
-                <w:rtl w:val="1"/>
-              </w:rPr>
-              <w:t xml:space="preserve">האוטיסטי</w:t>
+              <w:t xml:space="preserve">שהלומד</w:t>
+            </w:r>
+            <w:r>
+              <w:rPr>
+                <w:rFonts w:ascii="David" w:cs="David" w:eastAsia="David" w:hAnsi="David"/>
+                <w:sz w:val="24"/>
+                <w:szCs w:val="24"/>
+                <w:rtl w:val="1"/>
+              </w:rPr>
+              <w:t xml:space="preserve"> </w:t>
+            </w:r>
+            <w:r>
+              <w:rPr>
+                <w:rFonts w:ascii="David" w:cs="David" w:eastAsia="David" w:hAnsi="David"/>
+                <w:sz w:val="24"/>
+                <w:szCs w:val="24"/>
+                <w:rtl w:val="1"/>
+              </w:rPr>
+              <w:t xml:space="preserve">ישלוט</w:t>
+            </w:r>
+            <w:r>
+              <w:rPr>
+                <w:rFonts w:ascii="David" w:cs="David" w:eastAsia="David" w:hAnsi="David"/>
+                <w:sz w:val="24"/>
+                <w:szCs w:val="24"/>
+                <w:rtl w:val="1"/>
+              </w:rPr>
+              <w:t xml:space="preserve"> </w:t>
+            </w:r>
+            <w:r>
+              <w:rPr>
+                <w:rFonts w:ascii="David" w:cs="David" w:eastAsia="David" w:hAnsi="David"/>
+                <w:sz w:val="24"/>
+                <w:szCs w:val="24"/>
+                <w:rtl w:val="1"/>
+              </w:rPr>
+              <w:t xml:space="preserve">בעומס</w:t>
+            </w:r>
+            <w:r>
+              <w:rPr>
+                <w:rFonts w:ascii="David" w:cs="David" w:eastAsia="David" w:hAnsi="David"/>
+                <w:sz w:val="24"/>
+                <w:szCs w:val="24"/>
+                <w:rtl w:val="1"/>
+              </w:rPr>
+              <w:t xml:space="preserve"> </w:t>
+            </w:r>
+            <w:r>
+              <w:rPr>
+                <w:rFonts w:ascii="David" w:cs="David" w:eastAsia="David" w:hAnsi="David"/>
+                <w:sz w:val="24"/>
+                <w:szCs w:val="24"/>
+                <w:rtl w:val="1"/>
+              </w:rPr>
+              <w:t xml:space="preserve">החזותי</w:t>
+            </w:r>
+            <w:r>
+              <w:rPr>
+                <w:rFonts w:ascii="David" w:cs="David" w:eastAsia="David" w:hAnsi="David"/>
+                <w:sz w:val="24"/>
+                <w:szCs w:val="24"/>
+                <w:rtl w:val="1"/>
+              </w:rPr>
+              <w:t xml:space="preserve"> </w:t>
+            </w:r>
+            <w:r>
+              <w:rPr>
+                <w:rFonts w:ascii="David" w:cs="David" w:eastAsia="David" w:hAnsi="David"/>
+                <w:sz w:val="24"/>
+                <w:szCs w:val="24"/>
+                <w:rtl w:val="1"/>
+              </w:rPr>
+              <w:t xml:space="preserve">ולא</w:t>
+            </w:r>
+            <w:r>
+              <w:rPr>
+                <w:rFonts w:ascii="David" w:cs="David" w:eastAsia="David" w:hAnsi="David"/>
+                <w:sz w:val="24"/>
+                <w:szCs w:val="24"/>
+                <w:rtl w:val="1"/>
+              </w:rPr>
+              <w:t xml:space="preserve"> </w:t>
+            </w:r>
+            <w:r>
+              <w:rPr>
+                <w:rFonts w:ascii="David" w:cs="David" w:eastAsia="David" w:hAnsi="David"/>
+                <w:sz w:val="24"/>
+                <w:szCs w:val="24"/>
+                <w:rtl w:val="1"/>
+              </w:rPr>
+              <w:t xml:space="preserve">יופתע</w:t>
+            </w:r>
+            <w:r>
+              <w:rPr>
+                <w:rFonts w:ascii="David" w:cs="David" w:eastAsia="David" w:hAnsi="David"/>
+                <w:sz w:val="24"/>
+                <w:szCs w:val="24"/>
+                <w:rtl w:val="1"/>
+              </w:rPr>
+              <w:t xml:space="preserve"> </w:t>
+            </w:r>
+            <w:r>
+              <w:rPr>
+                <w:rFonts w:ascii="David" w:cs="David" w:eastAsia="David" w:hAnsi="David"/>
+                <w:sz w:val="24"/>
+                <w:szCs w:val="24"/>
+                <w:rtl w:val="1"/>
+              </w:rPr>
+              <w:t xml:space="preserve">מהיעלמות</w:t>
+            </w:r>
+            <w:r>
+              <w:rPr>
+                <w:rFonts w:ascii="David" w:cs="David" w:eastAsia="David" w:hAnsi="David"/>
+                <w:sz w:val="24"/>
+                <w:szCs w:val="24"/>
+                <w:rtl w:val="1"/>
+              </w:rPr>
+              <w:t xml:space="preserve"> </w:t>
+            </w:r>
+            <w:r>
+              <w:rPr>
+                <w:rFonts w:ascii="David" w:cs="David" w:eastAsia="David" w:hAnsi="David"/>
+                <w:sz w:val="24"/>
+                <w:szCs w:val="24"/>
+                <w:rtl w:val="1"/>
+              </w:rPr>
+              <w:t xml:space="preserve">פתאומית</w:t>
             </w:r>
             <w:r>
               <w:rPr>
@@ -9992,7 +10405,7 @@
                 <w:szCs w:val="28"/>
                 <w:rtl w:val="1"/>
               </w:rPr>
-              <w:t xml:space="preserve">2. </w:t>
+              <w:t xml:space="preserve">3. </w:t>
             </w:r>
             <w:r>
               <w:rPr>
@@ -10940,7 +11353,7 @@
                 <w:szCs w:val="28"/>
                 <w:rtl w:val="1"/>
               </w:rPr>
-              <w:t xml:space="preserve">2. </w:t>
+              <w:t xml:space="preserve">3. </w:t>
             </w:r>
             <w:r>
               <w:rPr>
@@ -11986,7 +12399,7 @@
                 <w:szCs w:val="28"/>
                 <w:rtl w:val="1"/>
               </w:rPr>
-              <w:t xml:space="preserve">2. </w:t>
+              <w:t xml:space="preserve">3. </w:t>
             </w:r>
             <w:r>
               <w:rPr>

</xml_diff>